<commit_message>
Update CV with UiB dept. seminar
</commit_message>
<xml_diff>
--- a/files/CV_Adam_Reiremo.docx
+++ b/files/CV_Adam_Reiremo.docx
@@ -84,21 +84,12 @@
                 <w:lang w:val="en-US"/>
               </w:rPr>
             </w:pPr>
-            <w:proofErr w:type="spellStart"/>
-            <w:r>
-              <w:rPr>
-                <w:rFonts w:ascii="Palatino Linotype" w:hAnsi="Palatino Linotype"/>
-                <w:lang w:val="en-US"/>
-              </w:rPr>
-              <w:t>Helleveien</w:t>
-            </w:r>
-            <w:proofErr w:type="spellEnd"/>
-            <w:r>
-              <w:rPr>
-                <w:rFonts w:ascii="Palatino Linotype" w:hAnsi="Palatino Linotype"/>
-                <w:lang w:val="en-US"/>
-              </w:rPr>
-              <w:t xml:space="preserve"> 30</w:t>
+            <w:r>
+              <w:rPr>
+                <w:rFonts w:ascii="Palatino Linotype" w:hAnsi="Palatino Linotype"/>
+                <w:lang w:val="en-US"/>
+              </w:rPr>
+              <w:t>Helleveien 30</w:t>
             </w:r>
           </w:p>
           <w:p>
@@ -1290,23 +1281,7 @@
           <w:rFonts w:ascii="Palatino Linotype" w:hAnsi="Palatino Linotype"/>
           <w:lang w:val="en-US"/>
         </w:rPr>
-        <w:t xml:space="preserve"> </w:t>
-      </w:r>
-      <w:proofErr w:type="gramStart"/>
-      <w:r>
-        <w:rPr>
-          <w:rFonts w:ascii="Palatino Linotype" w:hAnsi="Palatino Linotype"/>
-          <w:lang w:val="en-US"/>
-        </w:rPr>
-        <w:t>With</w:t>
-      </w:r>
-      <w:proofErr w:type="gramEnd"/>
-      <w:r>
-        <w:rPr>
-          <w:rFonts w:ascii="Palatino Linotype" w:hAnsi="Palatino Linotype"/>
-          <w:lang w:val="en-US"/>
-        </w:rPr>
-        <w:t xml:space="preserve"> Lisa Kahn and Alexander L. P. Willén</w:t>
+        <w:t xml:space="preserve"> With Lisa Kahn and Alexander L. P. Willén</w:t>
       </w:r>
     </w:p>
     <w:p>
@@ -2344,13 +2319,13 @@
         <w:tblLook w:val="04A0" w:firstRow="1" w:lastRow="0" w:firstColumn="1" w:lastColumn="0" w:noHBand="0" w:noVBand="1"/>
       </w:tblPr>
       <w:tblGrid>
-        <w:gridCol w:w="1418"/>
-        <w:gridCol w:w="7598"/>
+        <w:gridCol w:w="1134"/>
+        <w:gridCol w:w="7882"/>
       </w:tblGrid>
       <w:tr>
         <w:tc>
           <w:tcPr>
-            <w:tcW w:w="1418" w:type="dxa"/>
+            <w:tcW w:w="1134" w:type="dxa"/>
           </w:tcPr>
           <w:p>
             <w:pPr>
@@ -2365,13 +2340,13 @@
                 <w:rFonts w:ascii="Palatino Linotype" w:hAnsi="Palatino Linotype"/>
                 <w:lang w:val="en-US"/>
               </w:rPr>
-              <w:t>2025</w:t>
-            </w:r>
-          </w:p>
-        </w:tc>
-        <w:tc>
-          <w:tcPr>
-            <w:tcW w:w="7598" w:type="dxa"/>
+              <w:t>2026</w:t>
+            </w:r>
+          </w:p>
+        </w:tc>
+        <w:tc>
+          <w:tcPr>
+            <w:tcW w:w="7882" w:type="dxa"/>
           </w:tcPr>
           <w:p>
             <w:pPr>
@@ -2390,14 +2365,21 @@
                 <w:rFonts w:ascii="Palatino Linotype" w:hAnsi="Palatino Linotype"/>
                 <w:lang w:val="en-US"/>
               </w:rPr>
-              <w:t>NBER Summer Institute; Children and Families</w:t>
-            </w:r>
-            <w:r>
-              <w:rPr>
-                <w:rFonts w:ascii="Palatino Linotype" w:hAnsi="Palatino Linotype"/>
-                <w:lang w:val="en-US"/>
-              </w:rPr>
-              <w:t xml:space="preserve"> (presented by Jason Cook)</w:t>
+              <w:t>University of Bergen, department seminar (Sept</w:t>
+            </w:r>
+            <w:r>
+              <w:rPr>
+                <w:rFonts w:ascii="Palatino Linotype" w:hAnsi="Palatino Linotype"/>
+                <w:lang w:val="en-US"/>
+              </w:rPr>
+              <w:t>ember 29,</w:t>
+            </w:r>
+            <w:r>
+              <w:rPr>
+                <w:rFonts w:ascii="Palatino Linotype" w:hAnsi="Palatino Linotype"/>
+                <w:lang w:val="en-US"/>
+              </w:rPr>
+              <w:t xml:space="preserve"> by invitation)</w:t>
             </w:r>
           </w:p>
           <w:p>
@@ -2417,7 +2399,14 @@
                 <w:rFonts w:ascii="Palatino Linotype" w:hAnsi="Palatino Linotype"/>
                 <w:lang w:val="en-US"/>
               </w:rPr>
-              <w:t>Norwegian School of Economics / FAIR (brown bag seminar)</w:t>
+              <w:t>Norwegian School of Economics / FAIR (brown bag seminar</w:t>
+            </w:r>
+            <w:r>
+              <w:rPr>
+                <w:rFonts w:ascii="Palatino Linotype" w:hAnsi="Palatino Linotype"/>
+                <w:lang w:val="en-US"/>
+              </w:rPr>
+              <w:t>)</w:t>
             </w:r>
           </w:p>
         </w:tc>
@@ -2425,7 +2414,7 @@
       <w:tr>
         <w:tc>
           <w:tcPr>
-            <w:tcW w:w="1418" w:type="dxa"/>
+            <w:tcW w:w="1134" w:type="dxa"/>
           </w:tcPr>
           <w:p>
             <w:pPr>
@@ -2440,13 +2429,13 @@
                 <w:rFonts w:ascii="Palatino Linotype" w:hAnsi="Palatino Linotype"/>
                 <w:lang w:val="en-US"/>
               </w:rPr>
-              <w:t>2024</w:t>
-            </w:r>
-          </w:p>
-        </w:tc>
-        <w:tc>
-          <w:tcPr>
-            <w:tcW w:w="7598" w:type="dxa"/>
+              <w:t>2025</w:t>
+            </w:r>
+          </w:p>
+        </w:tc>
+        <w:tc>
+          <w:tcPr>
+            <w:tcW w:w="7882" w:type="dxa"/>
           </w:tcPr>
           <w:p>
             <w:pPr>
@@ -2465,35 +2454,14 @@
                 <w:rFonts w:ascii="Palatino Linotype" w:hAnsi="Palatino Linotype"/>
                 <w:lang w:val="en-US"/>
               </w:rPr>
-              <w:t>Bank of Italy; Nontraditional Data, Machine Learning, and Natura</w:t>
-            </w:r>
-            <w:r>
-              <w:rPr>
-                <w:rFonts w:ascii="Palatino Linotype" w:hAnsi="Palatino Linotype"/>
-                <w:lang w:val="en-US"/>
-              </w:rPr>
-              <w:t>l</w:t>
-            </w:r>
-            <w:r>
-              <w:rPr>
-                <w:rFonts w:ascii="Palatino Linotype" w:hAnsi="Palatino Linotype"/>
-                <w:lang w:val="en-US"/>
-              </w:rPr>
-              <w:t xml:space="preserve"> </w:t>
-            </w:r>
-            <w:r>
-              <w:rPr>
-                <w:rFonts w:ascii="Palatino Linotype" w:hAnsi="Palatino Linotype"/>
-                <w:lang w:val="en-US"/>
-              </w:rPr>
-              <w:t>Language Processing for Macroeconomics</w:t>
-            </w:r>
-            <w:r>
-              <w:rPr>
-                <w:rFonts w:ascii="Palatino Linotype" w:hAnsi="Palatino Linotype"/>
-                <w:lang w:val="en-US"/>
-              </w:rPr>
-              <w:t xml:space="preserve"> </w:t>
+              <w:t>NBER Summer Institute; Children and Families</w:t>
+            </w:r>
+            <w:r>
+              <w:rPr>
+                <w:rFonts w:ascii="Palatino Linotype" w:hAnsi="Palatino Linotype"/>
+                <w:lang w:val="en-US"/>
+              </w:rPr>
+              <w:t xml:space="preserve"> (presented by Jason Cook)</w:t>
             </w:r>
           </w:p>
           <w:p>
@@ -2516,6 +2484,34 @@
               <w:t>Norwegian School of Economics / FAIR (brown bag seminar)</w:t>
             </w:r>
           </w:p>
+        </w:tc>
+      </w:tr>
+      <w:tr>
+        <w:tc>
+          <w:tcPr>
+            <w:tcW w:w="1134" w:type="dxa"/>
+          </w:tcPr>
+          <w:p>
+            <w:pPr>
+              <w:jc w:val="right"/>
+              <w:rPr>
+                <w:rFonts w:ascii="Palatino Linotype" w:hAnsi="Palatino Linotype"/>
+                <w:lang w:val="en-US"/>
+              </w:rPr>
+            </w:pPr>
+            <w:r>
+              <w:rPr>
+                <w:rFonts w:ascii="Palatino Linotype" w:hAnsi="Palatino Linotype"/>
+                <w:lang w:val="en-US"/>
+              </w:rPr>
+              <w:t>2024</w:t>
+            </w:r>
+          </w:p>
+        </w:tc>
+        <w:tc>
+          <w:tcPr>
+            <w:tcW w:w="7882" w:type="dxa"/>
+          </w:tcPr>
           <w:p>
             <w:pPr>
               <w:pStyle w:val="ListParagraph"/>
@@ -2533,44 +2529,37 @@
                 <w:rFonts w:ascii="Palatino Linotype" w:hAnsi="Palatino Linotype"/>
                 <w:lang w:val="en-US"/>
               </w:rPr>
-              <w:t>University of Oslo</w:t>
-            </w:r>
-            <w:r>
-              <w:rPr>
-                <w:rFonts w:ascii="Palatino Linotype" w:hAnsi="Palatino Linotype"/>
-                <w:lang w:val="en-US"/>
-              </w:rPr>
-              <w:t>, Department Seminar</w:t>
-            </w:r>
-          </w:p>
-        </w:tc>
-      </w:tr>
-      <w:tr>
-        <w:tc>
-          <w:tcPr>
-            <w:tcW w:w="1418" w:type="dxa"/>
-          </w:tcPr>
-          <w:p>
-            <w:pPr>
-              <w:jc w:val="right"/>
-              <w:rPr>
-                <w:rFonts w:ascii="Palatino Linotype" w:hAnsi="Palatino Linotype"/>
-                <w:lang w:val="en-US"/>
-              </w:rPr>
-            </w:pPr>
-            <w:r>
-              <w:rPr>
-                <w:rFonts w:ascii="Palatino Linotype" w:hAnsi="Palatino Linotype"/>
-                <w:lang w:val="en-US"/>
-              </w:rPr>
-              <w:t>2023</w:t>
-            </w:r>
-          </w:p>
-        </w:tc>
-        <w:tc>
-          <w:tcPr>
-            <w:tcW w:w="7598" w:type="dxa"/>
-          </w:tcPr>
+              <w:t>Bank of Italy; Nontraditional Data, Machine Learning, and Natura</w:t>
+            </w:r>
+            <w:r>
+              <w:rPr>
+                <w:rFonts w:ascii="Palatino Linotype" w:hAnsi="Palatino Linotype"/>
+                <w:lang w:val="en-US"/>
+              </w:rPr>
+              <w:t>l</w:t>
+            </w:r>
+            <w:r>
+              <w:rPr>
+                <w:rFonts w:ascii="Palatino Linotype" w:hAnsi="Palatino Linotype"/>
+                <w:lang w:val="en-US"/>
+              </w:rPr>
+              <w:t xml:space="preserve"> </w:t>
+            </w:r>
+            <w:r>
+              <w:rPr>
+                <w:rFonts w:ascii="Palatino Linotype" w:hAnsi="Palatino Linotype"/>
+                <w:lang w:val="en-US"/>
+              </w:rPr>
+              <w:t>Language Processing for Macroeconomics</w:t>
+            </w:r>
+            <w:r>
+              <w:rPr>
+                <w:rFonts w:ascii="Palatino Linotype" w:hAnsi="Palatino Linotype"/>
+                <w:lang w:val="en-US"/>
+              </w:rPr>
+              <w:t xml:space="preserve"> </w:t>
+            </w:r>
+          </w:p>
           <w:p>
             <w:pPr>
               <w:pStyle w:val="ListParagraph"/>
@@ -2583,51 +2572,14 @@
                 <w:lang w:val="en-US"/>
               </w:rPr>
             </w:pPr>
-            <w:proofErr w:type="spellStart"/>
-            <w:r>
-              <w:rPr>
-                <w:rFonts w:ascii="Palatino Linotype" w:hAnsi="Palatino Linotype"/>
-                <w:lang w:val="en-US"/>
-              </w:rPr>
-              <w:t>CESifo</w:t>
-            </w:r>
-            <w:proofErr w:type="spellEnd"/>
-            <w:r>
-              <w:rPr>
-                <w:rFonts w:ascii="Palatino Linotype" w:hAnsi="Palatino Linotype"/>
-                <w:lang w:val="en-US"/>
-              </w:rPr>
-              <w:t xml:space="preserve"> / Junior Workshop on the Economics of Education</w:t>
-            </w:r>
-          </w:p>
-        </w:tc>
-      </w:tr>
-      <w:tr>
-        <w:tc>
-          <w:tcPr>
-            <w:tcW w:w="1418" w:type="dxa"/>
-          </w:tcPr>
-          <w:p>
-            <w:pPr>
-              <w:jc w:val="right"/>
-              <w:rPr>
-                <w:rFonts w:ascii="Palatino Linotype" w:hAnsi="Palatino Linotype"/>
-                <w:lang w:val="en-US"/>
-              </w:rPr>
-            </w:pPr>
-            <w:r>
-              <w:rPr>
-                <w:rFonts w:ascii="Palatino Linotype" w:hAnsi="Palatino Linotype"/>
-                <w:lang w:val="en-US"/>
-              </w:rPr>
-              <w:t>2023</w:t>
-            </w:r>
-          </w:p>
-        </w:tc>
-        <w:tc>
-          <w:tcPr>
-            <w:tcW w:w="7598" w:type="dxa"/>
-          </w:tcPr>
+            <w:r>
+              <w:rPr>
+                <w:rFonts w:ascii="Palatino Linotype" w:hAnsi="Palatino Linotype"/>
+                <w:lang w:val="en-US"/>
+              </w:rPr>
+              <w:t>Norwegian School of Economics / FAIR (brown bag seminar)</w:t>
+            </w:r>
+          </w:p>
           <w:p>
             <w:pPr>
               <w:pStyle w:val="ListParagraph"/>
@@ -2652,28 +2604,7 @@
                 <w:rFonts w:ascii="Palatino Linotype" w:hAnsi="Palatino Linotype"/>
                 <w:lang w:val="en-US"/>
               </w:rPr>
-              <w:t>;</w:t>
-            </w:r>
-            <w:r>
-              <w:rPr>
-                <w:rFonts w:ascii="Palatino Linotype" w:hAnsi="Palatino Linotype"/>
-                <w:lang w:val="en-US"/>
-              </w:rPr>
-              <w:t xml:space="preserve"> PhD Workshop</w:t>
-            </w:r>
-            <w:r>
-              <w:rPr>
-                <w:rFonts w:ascii="Palatino Linotype" w:hAnsi="Palatino Linotype"/>
-                <w:lang w:val="en-US"/>
-              </w:rPr>
-              <w:t>;</w:t>
-            </w:r>
-            <w:r>
-              <w:rPr>
-                <w:rFonts w:ascii="Palatino Linotype" w:hAnsi="Palatino Linotype"/>
-                <w:lang w:val="en-US"/>
-              </w:rPr>
-              <w:t xml:space="preserve"> Oslo PhD Initiative in Economic</w:t>
+              <w:t>, Department Seminar</w:t>
             </w:r>
           </w:p>
         </w:tc>
@@ -2681,7 +2612,7 @@
       <w:tr>
         <w:tc>
           <w:tcPr>
-            <w:tcW w:w="1418" w:type="dxa"/>
+            <w:tcW w:w="1134" w:type="dxa"/>
           </w:tcPr>
           <w:p>
             <w:pPr>
@@ -2696,13 +2627,13 @@
                 <w:rFonts w:ascii="Palatino Linotype" w:hAnsi="Palatino Linotype"/>
                 <w:lang w:val="en-US"/>
               </w:rPr>
-              <w:t>2022</w:t>
-            </w:r>
-          </w:p>
-        </w:tc>
-        <w:tc>
-          <w:tcPr>
-            <w:tcW w:w="7598" w:type="dxa"/>
+              <w:t>2023</w:t>
+            </w:r>
+          </w:p>
+        </w:tc>
+        <w:tc>
+          <w:tcPr>
+            <w:tcW w:w="7882" w:type="dxa"/>
           </w:tcPr>
           <w:p>
             <w:pPr>
@@ -2721,7 +2652,7 @@
                 <w:rFonts w:ascii="Palatino Linotype" w:hAnsi="Palatino Linotype"/>
                 <w:lang w:val="en-US"/>
               </w:rPr>
-              <w:t>University of Oslo; Workshop; The Demand and Supply of Public Education</w:t>
+              <w:t>CESifo / Junior Workshop on the Economics of Education</w:t>
             </w:r>
           </w:p>
         </w:tc>
@@ -2729,7 +2660,7 @@
       <w:tr>
         <w:tc>
           <w:tcPr>
-            <w:tcW w:w="1418" w:type="dxa"/>
+            <w:tcW w:w="1134" w:type="dxa"/>
           </w:tcPr>
           <w:p>
             <w:pPr>
@@ -2744,20 +2675,13 @@
                 <w:rFonts w:ascii="Palatino Linotype" w:hAnsi="Palatino Linotype"/>
                 <w:lang w:val="en-US"/>
               </w:rPr>
-              <w:t>202</w:t>
-            </w:r>
-            <w:r>
-              <w:rPr>
-                <w:rFonts w:ascii="Palatino Linotype" w:hAnsi="Palatino Linotype"/>
-                <w:lang w:val="en-US"/>
-              </w:rPr>
-              <w:t>2</w:t>
-            </w:r>
-          </w:p>
-        </w:tc>
-        <w:tc>
-          <w:tcPr>
-            <w:tcW w:w="7598" w:type="dxa"/>
+              <w:t>2023</w:t>
+            </w:r>
+          </w:p>
+        </w:tc>
+        <w:tc>
+          <w:tcPr>
+            <w:tcW w:w="7882" w:type="dxa"/>
           </w:tcPr>
           <w:p>
             <w:pPr>
@@ -2776,7 +2700,35 @@
                 <w:rFonts w:ascii="Palatino Linotype" w:hAnsi="Palatino Linotype"/>
                 <w:lang w:val="en-US"/>
               </w:rPr>
-              <w:t>University of Oslo; PhD Workshop; Oslo PhD Initiative in Economic</w:t>
+              <w:t>University of Oslo</w:t>
+            </w:r>
+            <w:r>
+              <w:rPr>
+                <w:rFonts w:ascii="Palatino Linotype" w:hAnsi="Palatino Linotype"/>
+                <w:lang w:val="en-US"/>
+              </w:rPr>
+              <w:t>;</w:t>
+            </w:r>
+            <w:r>
+              <w:rPr>
+                <w:rFonts w:ascii="Palatino Linotype" w:hAnsi="Palatino Linotype"/>
+                <w:lang w:val="en-US"/>
+              </w:rPr>
+              <w:t xml:space="preserve"> PhD Workshop</w:t>
+            </w:r>
+            <w:r>
+              <w:rPr>
+                <w:rFonts w:ascii="Palatino Linotype" w:hAnsi="Palatino Linotype"/>
+                <w:lang w:val="en-US"/>
+              </w:rPr>
+              <w:t>;</w:t>
+            </w:r>
+            <w:r>
+              <w:rPr>
+                <w:rFonts w:ascii="Palatino Linotype" w:hAnsi="Palatino Linotype"/>
+                <w:lang w:val="en-US"/>
+              </w:rPr>
+              <w:t xml:space="preserve"> Oslo PhD Initiative in Economic</w:t>
             </w:r>
           </w:p>
         </w:tc>
@@ -2784,7 +2736,7 @@
       <w:tr>
         <w:tc>
           <w:tcPr>
-            <w:tcW w:w="1418" w:type="dxa"/>
+            <w:tcW w:w="1134" w:type="dxa"/>
           </w:tcPr>
           <w:p>
             <w:pPr>
@@ -2805,7 +2757,7 @@
         </w:tc>
         <w:tc>
           <w:tcPr>
-            <w:tcW w:w="7598" w:type="dxa"/>
+            <w:tcW w:w="7882" w:type="dxa"/>
           </w:tcPr>
           <w:p>
             <w:pPr>
@@ -2824,6 +2776,109 @@
                 <w:rFonts w:ascii="Palatino Linotype" w:hAnsi="Palatino Linotype"/>
                 <w:lang w:val="en-US"/>
               </w:rPr>
+              <w:t>University of Oslo; Workshop; The Demand and Supply of Public Education</w:t>
+            </w:r>
+          </w:p>
+        </w:tc>
+      </w:tr>
+      <w:tr>
+        <w:tc>
+          <w:tcPr>
+            <w:tcW w:w="1134" w:type="dxa"/>
+          </w:tcPr>
+          <w:p>
+            <w:pPr>
+              <w:jc w:val="right"/>
+              <w:rPr>
+                <w:rFonts w:ascii="Palatino Linotype" w:hAnsi="Palatino Linotype"/>
+                <w:lang w:val="en-US"/>
+              </w:rPr>
+            </w:pPr>
+            <w:r>
+              <w:rPr>
+                <w:rFonts w:ascii="Palatino Linotype" w:hAnsi="Palatino Linotype"/>
+                <w:lang w:val="en-US"/>
+              </w:rPr>
+              <w:t>202</w:t>
+            </w:r>
+            <w:r>
+              <w:rPr>
+                <w:rFonts w:ascii="Palatino Linotype" w:hAnsi="Palatino Linotype"/>
+                <w:lang w:val="en-US"/>
+              </w:rPr>
+              <w:t>2</w:t>
+            </w:r>
+          </w:p>
+        </w:tc>
+        <w:tc>
+          <w:tcPr>
+            <w:tcW w:w="7882" w:type="dxa"/>
+          </w:tcPr>
+          <w:p>
+            <w:pPr>
+              <w:pStyle w:val="ListParagraph"/>
+              <w:numPr>
+                <w:ilvl w:val="0"/>
+                <w:numId w:val="2"/>
+              </w:numPr>
+              <w:rPr>
+                <w:rFonts w:ascii="Palatino Linotype" w:hAnsi="Palatino Linotype"/>
+                <w:lang w:val="en-US"/>
+              </w:rPr>
+            </w:pPr>
+            <w:r>
+              <w:rPr>
+                <w:rFonts w:ascii="Palatino Linotype" w:hAnsi="Palatino Linotype"/>
+                <w:lang w:val="en-US"/>
+              </w:rPr>
+              <w:t>University of Oslo; PhD Workshop; Oslo PhD Initiative in Economic</w:t>
+            </w:r>
+          </w:p>
+        </w:tc>
+      </w:tr>
+      <w:tr>
+        <w:tc>
+          <w:tcPr>
+            <w:tcW w:w="1134" w:type="dxa"/>
+          </w:tcPr>
+          <w:p>
+            <w:pPr>
+              <w:jc w:val="right"/>
+              <w:rPr>
+                <w:rFonts w:ascii="Palatino Linotype" w:hAnsi="Palatino Linotype"/>
+                <w:lang w:val="en-US"/>
+              </w:rPr>
+            </w:pPr>
+            <w:r>
+              <w:rPr>
+                <w:rFonts w:ascii="Palatino Linotype" w:hAnsi="Palatino Linotype"/>
+                <w:lang w:val="en-US"/>
+              </w:rPr>
+              <w:t>2022</w:t>
+            </w:r>
+          </w:p>
+        </w:tc>
+        <w:tc>
+          <w:tcPr>
+            <w:tcW w:w="7882" w:type="dxa"/>
+          </w:tcPr>
+          <w:p>
+            <w:pPr>
+              <w:pStyle w:val="ListParagraph"/>
+              <w:numPr>
+                <w:ilvl w:val="0"/>
+                <w:numId w:val="2"/>
+              </w:numPr>
+              <w:rPr>
+                <w:rFonts w:ascii="Palatino Linotype" w:hAnsi="Palatino Linotype"/>
+                <w:lang w:val="en-US"/>
+              </w:rPr>
+            </w:pPr>
+            <w:r>
+              <w:rPr>
+                <w:rFonts w:ascii="Palatino Linotype" w:hAnsi="Palatino Linotype"/>
+                <w:lang w:val="en-US"/>
+              </w:rPr>
               <w:t>Lund University; PhD Workshop in the Economics of Education</w:t>
             </w:r>
           </w:p>
@@ -2835,7 +2890,7 @@
         </w:trPr>
         <w:tc>
           <w:tcPr>
-            <w:tcW w:w="1418" w:type="dxa"/>
+            <w:tcW w:w="1134" w:type="dxa"/>
           </w:tcPr>
           <w:p>
             <w:pPr>
@@ -2856,7 +2911,7 @@
         </w:tc>
         <w:tc>
           <w:tcPr>
-            <w:tcW w:w="7598" w:type="dxa"/>
+            <w:tcW w:w="7882" w:type="dxa"/>
           </w:tcPr>
           <w:p>
             <w:pPr>

</xml_diff>

<commit_message>
Fix CV (remove placeholders)
</commit_message>
<xml_diff>
--- a/files/CV_Adam_Reiremo.docx
+++ b/files/CV_Adam_Reiremo.docx
@@ -84,12 +84,21 @@
                 <w:lang w:val="en-US"/>
               </w:rPr>
             </w:pPr>
-            <w:r>
-              <w:rPr>
-                <w:rFonts w:ascii="Palatino Linotype" w:hAnsi="Palatino Linotype"/>
-                <w:lang w:val="en-US"/>
-              </w:rPr>
-              <w:t>Helleveien 30</w:t>
+            <w:proofErr w:type="spellStart"/>
+            <w:r>
+              <w:rPr>
+                <w:rFonts w:ascii="Palatino Linotype" w:hAnsi="Palatino Linotype"/>
+                <w:lang w:val="en-US"/>
+              </w:rPr>
+              <w:t>Helleveien</w:t>
+            </w:r>
+            <w:proofErr w:type="spellEnd"/>
+            <w:r>
+              <w:rPr>
+                <w:rFonts w:ascii="Palatino Linotype" w:hAnsi="Palatino Linotype"/>
+                <w:lang w:val="en-US"/>
+              </w:rPr>
+              <w:t xml:space="preserve"> 30</w:t>
             </w:r>
           </w:p>
           <w:p>
@@ -1281,7 +1290,23 @@
           <w:rFonts w:ascii="Palatino Linotype" w:hAnsi="Palatino Linotype"/>
           <w:lang w:val="en-US"/>
         </w:rPr>
-        <w:t xml:space="preserve"> With Lisa Kahn and Alexander L. P. Willén</w:t>
+        <w:t xml:space="preserve"> </w:t>
+      </w:r>
+      <w:proofErr w:type="gramStart"/>
+      <w:r>
+        <w:rPr>
+          <w:rFonts w:ascii="Palatino Linotype" w:hAnsi="Palatino Linotype"/>
+          <w:lang w:val="en-US"/>
+        </w:rPr>
+        <w:t>With</w:t>
+      </w:r>
+      <w:proofErr w:type="gramEnd"/>
+      <w:r>
+        <w:rPr>
+          <w:rFonts w:ascii="Palatino Linotype" w:hAnsi="Palatino Linotype"/>
+          <w:lang w:val="en-US"/>
+        </w:rPr>
+        <w:t xml:space="preserve"> Lisa Kahn and Alexander L. P. Willén</w:t>
       </w:r>
     </w:p>
     <w:p>
@@ -2647,12 +2672,21 @@
                 <w:lang w:val="en-US"/>
               </w:rPr>
             </w:pPr>
-            <w:r>
-              <w:rPr>
-                <w:rFonts w:ascii="Palatino Linotype" w:hAnsi="Palatino Linotype"/>
-                <w:lang w:val="en-US"/>
-              </w:rPr>
-              <w:t>CESifo / Junior Workshop on the Economics of Education</w:t>
+            <w:proofErr w:type="spellStart"/>
+            <w:r>
+              <w:rPr>
+                <w:rFonts w:ascii="Palatino Linotype" w:hAnsi="Palatino Linotype"/>
+                <w:lang w:val="en-US"/>
+              </w:rPr>
+              <w:t>CESifo</w:t>
+            </w:r>
+            <w:proofErr w:type="spellEnd"/>
+            <w:r>
+              <w:rPr>
+                <w:rFonts w:ascii="Palatino Linotype" w:hAnsi="Palatino Linotype"/>
+                <w:lang w:val="en-US"/>
+              </w:rPr>
+              <w:t xml:space="preserve"> / Junior Workshop on the Economics of Education</w:t>
             </w:r>
           </w:p>
         </w:tc>
@@ -4109,7 +4143,6 @@
   <w:style w:type="character" w:default="1" w:styleId="DefaultParagraphFont">
     <w:name w:val="Default Paragraph Font"/>
     <w:uiPriority w:val="1"/>
-    <w:semiHidden/>
     <w:unhideWhenUsed/>
   </w:style>
   <w:style w:type="table" w:default="1" w:styleId="TableNormal">

</xml_diff>

<commit_message>
Fix bug in CV
</commit_message>
<xml_diff>
--- a/files/CV_Adam_Reiremo.docx
+++ b/files/CV_Adam_Reiremo.docx
@@ -84,21 +84,12 @@
                 <w:lang w:val="en-US"/>
               </w:rPr>
             </w:pPr>
-            <w:proofErr w:type="spellStart"/>
-            <w:r>
-              <w:rPr>
-                <w:rFonts w:ascii="Palatino Linotype" w:hAnsi="Palatino Linotype"/>
-                <w:lang w:val="en-US"/>
-              </w:rPr>
-              <w:t>Helleveien</w:t>
-            </w:r>
-            <w:proofErr w:type="spellEnd"/>
-            <w:r>
-              <w:rPr>
-                <w:rFonts w:ascii="Palatino Linotype" w:hAnsi="Palatino Linotype"/>
-                <w:lang w:val="en-US"/>
-              </w:rPr>
-              <w:t xml:space="preserve"> 30</w:t>
+            <w:r>
+              <w:rPr>
+                <w:rFonts w:ascii="Palatino Linotype" w:hAnsi="Palatino Linotype"/>
+                <w:lang w:val="en-US"/>
+              </w:rPr>
+              <w:t>Helleveien 30</w:t>
             </w:r>
           </w:p>
           <w:p>
@@ -1358,23 +1349,7 @@
           <w:rFonts w:ascii="Palatino Linotype" w:hAnsi="Palatino Linotype"/>
           <w:lang w:val="en-US"/>
         </w:rPr>
-        <w:t xml:space="preserve"> </w:t>
-      </w:r>
-      <w:proofErr w:type="gramStart"/>
-      <w:r>
-        <w:rPr>
-          <w:rFonts w:ascii="Palatino Linotype" w:hAnsi="Palatino Linotype"/>
-          <w:lang w:val="en-US"/>
-        </w:rPr>
-        <w:t>With</w:t>
-      </w:r>
-      <w:proofErr w:type="gramEnd"/>
-      <w:r>
-        <w:rPr>
-          <w:rFonts w:ascii="Palatino Linotype" w:hAnsi="Palatino Linotype"/>
-          <w:lang w:val="en-US"/>
-        </w:rPr>
-        <w:t xml:space="preserve"> Lisa Kahn and Alexander L. P. Willén</w:t>
+        <w:t xml:space="preserve"> With Lisa Kahn and Alexander L. P. Willén</w:t>
       </w:r>
     </w:p>
     <w:p>
@@ -1539,27 +1514,7 @@
                   <w:iCs/>
                   <w:lang w:val="en-US"/>
                 </w:rPr>
-                <w:t xml:space="preserve">Reproducibility and Robustness of </w:t>
-              </w:r>
-              <w:r>
-                <w:rPr>
-                  <w:rStyle w:val="Hyperlink"/>
-                  <w:rFonts w:ascii="Palatino Linotype" w:hAnsi="Palatino Linotype"/>
-                  <w:i/>
-                  <w:iCs/>
-                  <w:lang w:val="en-US"/>
-                </w:rPr>
-                <w:t>E</w:t>
-              </w:r>
-              <w:r>
-                <w:rPr>
-                  <w:rStyle w:val="Hyperlink"/>
-                  <w:rFonts w:ascii="Palatino Linotype" w:hAnsi="Palatino Linotype"/>
-                  <w:i/>
-                  <w:iCs/>
-                  <w:lang w:val="en-US"/>
-                </w:rPr>
-                <w:t>conomics and Political Science Research</w:t>
+                <w:t>Reproducibility and Robustness of Economics and Political Science Research</w:t>
               </w:r>
             </w:hyperlink>
             <w:r>
@@ -1927,21 +1882,7 @@
                 <w:rFonts w:ascii="Palatino Linotype" w:hAnsi="Palatino Linotype"/>
                 <w:lang w:val="en-US"/>
               </w:rPr>
-              <w:t>Exam-preparation session in</w:t>
-            </w:r>
-            <w:r>
-              <w:rPr>
-                <w:rFonts w:ascii="Palatino Linotype" w:hAnsi="Palatino Linotype"/>
-                <w:lang w:val="en-US"/>
-              </w:rPr>
-              <w:t xml:space="preserve"> Microeconomics 2</w:t>
-            </w:r>
-            <w:r>
-              <w:rPr>
-                <w:rFonts w:ascii="Palatino Linotype" w:hAnsi="Palatino Linotype"/>
-                <w:lang w:val="en-US"/>
-              </w:rPr>
-              <w:t xml:space="preserve">; </w:t>
+              <w:t xml:space="preserve">Exam-preparation session in Microeconomics 2; </w:t>
             </w:r>
           </w:p>
           <w:p>
@@ -2492,23 +2433,21 @@
                 <w:rFonts w:ascii="Palatino Linotype" w:hAnsi="Palatino Linotype"/>
                 <w:lang w:val="en-US"/>
               </w:rPr>
-              <w:t xml:space="preserve">, Moving Ahead with AI? Equitable Adaptation in School and Educational Transitions in the Nordic-Baltic Region (AHEAD), </w:t>
-            </w:r>
-            <w:proofErr w:type="spellStart"/>
-            <w:r>
-              <w:rPr>
-                <w:rFonts w:ascii="Palatino Linotype" w:hAnsi="Palatino Linotype"/>
-                <w:lang w:val="en-US"/>
-              </w:rPr>
-              <w:t>NordForsk</w:t>
-            </w:r>
-            <w:proofErr w:type="spellEnd"/>
-            <w:r>
-              <w:rPr>
-                <w:rFonts w:ascii="Palatino Linotype" w:hAnsi="Palatino Linotype"/>
-                <w:lang w:val="en-US"/>
-              </w:rPr>
-              <w:t>, 2027–2029. PI: Kjell Gunnar Salvanes. Budget: NOK 13 million.</w:t>
+              <w:t>, Moving Ahead with AI? Equitable Adaptation in School and Educational Transitions in the Nordic-Baltic Region (AHEAD), NordForsk, 2027–2029. PI: Kjell Gunnar Salvanes. Budget: NOK 1</w:t>
+            </w:r>
+            <w:r>
+              <w:rPr>
+                <w:rFonts w:ascii="Palatino Linotype" w:hAnsi="Palatino Linotype"/>
+                <w:lang w:val="en-US"/>
+              </w:rPr>
+              <w:t>2</w:t>
+            </w:r>
+            <w:r>
+              <w:rPr>
+                <w:rFonts w:ascii="Palatino Linotype" w:hAnsi="Palatino Linotype"/>
+                <w:lang w:val="en-US"/>
+              </w:rPr>
+              <w:t xml:space="preserve"> million.</w:t>
             </w:r>
             <w:r>
               <w:rPr>
@@ -3148,21 +3087,12 @@
                 <w:lang w:val="en-US"/>
               </w:rPr>
             </w:pPr>
-            <w:proofErr w:type="spellStart"/>
-            <w:r>
-              <w:rPr>
-                <w:rFonts w:ascii="Palatino Linotype" w:hAnsi="Palatino Linotype"/>
-                <w:lang w:val="en-US"/>
-              </w:rPr>
-              <w:t>CESifo</w:t>
-            </w:r>
-            <w:proofErr w:type="spellEnd"/>
-            <w:r>
-              <w:rPr>
-                <w:rFonts w:ascii="Palatino Linotype" w:hAnsi="Palatino Linotype"/>
-                <w:lang w:val="en-US"/>
-              </w:rPr>
-              <w:t xml:space="preserve"> / Junior Workshop on the Economics of Education</w:t>
+            <w:r>
+              <w:rPr>
+                <w:rFonts w:ascii="Palatino Linotype" w:hAnsi="Palatino Linotype"/>
+                <w:lang w:val="en-US"/>
+              </w:rPr>
+              <w:t>CESifo / Junior Workshop on the Economics of Education</w:t>
             </w:r>
           </w:p>
         </w:tc>
@@ -3293,14 +3223,7 @@
                 <w:rFonts w:ascii="Palatino Linotype" w:hAnsi="Palatino Linotype"/>
                 <w:lang w:val="en-US"/>
               </w:rPr>
-              <w:t xml:space="preserve"> </w:t>
-            </w:r>
-            <w:r>
-              <w:rPr>
-                <w:rFonts w:ascii="Palatino Linotype" w:hAnsi="Palatino Linotype"/>
-                <w:lang w:val="en-US"/>
-              </w:rPr>
-              <w:t>(by invitation)</w:t>
+              <w:t xml:space="preserve"> (by invitation)</w:t>
             </w:r>
           </w:p>
         </w:tc>
@@ -3700,7 +3623,6 @@
         </w:rPr>
       </w:pPr>
       <w:hyperlink r:id="rId9" w:history="1">
-        <w:proofErr w:type="spellStart"/>
         <w:r>
           <w:rPr>
             <w:rStyle w:val="Hyperlink"/>
@@ -3709,19 +3631,8 @@
             <w:bCs/>
             <w:lang w:val="en-US"/>
           </w:rPr>
-          <w:t>S</w:t>
+          <w:t>Statapar</w:t>
         </w:r>
-        <w:r>
-          <w:rPr>
-            <w:rStyle w:val="Hyperlink"/>
-            <w:rFonts w:ascii="Palatino Linotype" w:hAnsi="Palatino Linotype"/>
-            <w:b/>
-            <w:bCs/>
-            <w:lang w:val="en-US"/>
-          </w:rPr>
-          <w:t>tatapar</w:t>
-        </w:r>
-        <w:proofErr w:type="spellEnd"/>
       </w:hyperlink>
       <w:r>
         <w:rPr>
@@ -3739,7 +3650,6 @@
         </w:rPr>
       </w:pPr>
       <w:hyperlink r:id="rId10" w:history="1">
-        <w:proofErr w:type="spellStart"/>
         <w:r>
           <w:rPr>
             <w:rStyle w:val="Hyperlink"/>
@@ -3750,7 +3660,6 @@
           </w:rPr>
           <w:t>Statex</w:t>
         </w:r>
-        <w:proofErr w:type="spellEnd"/>
       </w:hyperlink>
       <w:r>
         <w:rPr>
@@ -3874,33 +3783,7 @@
             <w:rFonts w:ascii="Palatino Linotype" w:hAnsi="Palatino Linotype"/>
             <w:lang w:val="en-US"/>
           </w:rPr>
-          <w:t xml:space="preserve">Dagens </w:t>
-        </w:r>
-        <w:proofErr w:type="spellStart"/>
-        <w:r>
-          <w:rPr>
-            <w:rStyle w:val="Hyperlink"/>
-            <w:rFonts w:ascii="Palatino Linotype" w:hAnsi="Palatino Linotype"/>
-            <w:lang w:val="en-US"/>
-          </w:rPr>
-          <w:t>Næringsliv</w:t>
-        </w:r>
-        <w:proofErr w:type="spellEnd"/>
-        <w:r>
-          <w:rPr>
-            <w:rStyle w:val="Hyperlink"/>
-            <w:rFonts w:ascii="Palatino Linotype" w:hAnsi="Palatino Linotype"/>
-            <w:lang w:val="en-US"/>
-          </w:rPr>
-          <w:t xml:space="preserve">, </w:t>
-        </w:r>
-        <w:r>
-          <w:rPr>
-            <w:rStyle w:val="Hyperlink"/>
-            <w:rFonts w:ascii="Palatino Linotype" w:hAnsi="Palatino Linotype"/>
-            <w:lang w:val="en-US"/>
-          </w:rPr>
-          <w:t>2021.</w:t>
+          <w:t>Dagens Næringsliv, 2021.</w:t>
         </w:r>
       </w:hyperlink>
     </w:p>
@@ -4828,6 +4711,7 @@
   <w:style w:type="character" w:default="1" w:styleId="DefaultParagraphFont">
     <w:name w:val="Default Paragraph Font"/>
     <w:uiPriority w:val="1"/>
+    <w:semiHidden/>
     <w:unhideWhenUsed/>
   </w:style>
   <w:style w:type="table" w:default="1" w:styleId="TableNormal">

</xml_diff>

<commit_message>
Add european vacancy concertium to CV
</commit_message>
<xml_diff>
--- a/files/CV_Adam_Reiremo.docx
+++ b/files/CV_Adam_Reiremo.docx
@@ -84,12 +84,21 @@
                 <w:lang w:val="en-US"/>
               </w:rPr>
             </w:pPr>
-            <w:r>
-              <w:rPr>
-                <w:rFonts w:ascii="Palatino Linotype" w:hAnsi="Palatino Linotype"/>
-                <w:lang w:val="en-US"/>
-              </w:rPr>
-              <w:t>Helleveien 30</w:t>
+            <w:proofErr w:type="spellStart"/>
+            <w:r>
+              <w:rPr>
+                <w:rFonts w:ascii="Palatino Linotype" w:hAnsi="Palatino Linotype"/>
+                <w:lang w:val="en-US"/>
+              </w:rPr>
+              <w:t>Helleveien</w:t>
+            </w:r>
+            <w:proofErr w:type="spellEnd"/>
+            <w:r>
+              <w:rPr>
+                <w:rFonts w:ascii="Palatino Linotype" w:hAnsi="Palatino Linotype"/>
+                <w:lang w:val="en-US"/>
+              </w:rPr>
+              <w:t xml:space="preserve"> 30</w:t>
             </w:r>
           </w:p>
           <w:p>
@@ -587,6 +596,71 @@
               </w:rPr>
               <w:t>Berlin</w:t>
             </w:r>
+          </w:p>
+        </w:tc>
+      </w:tr>
+      <w:tr>
+        <w:tc>
+          <w:tcPr>
+            <w:tcW w:w="3256" w:type="dxa"/>
+            <w:tcBorders>
+              <w:top w:val="nil"/>
+              <w:left w:val="nil"/>
+              <w:bottom w:val="nil"/>
+              <w:right w:val="nil"/>
+            </w:tcBorders>
+          </w:tcPr>
+          <w:p>
+            <w:pPr>
+              <w:jc w:val="right"/>
+              <w:rPr>
+                <w:rFonts w:ascii="Palatino Linotype" w:hAnsi="Palatino Linotype"/>
+                <w:lang w:val="en-US"/>
+              </w:rPr>
+            </w:pPr>
+            <w:r>
+              <w:rPr>
+                <w:rFonts w:ascii="Palatino Linotype" w:hAnsi="Palatino Linotype"/>
+                <w:lang w:val="en-US"/>
+              </w:rPr>
+              <w:t>2024 - Present</w:t>
+            </w:r>
+          </w:p>
+        </w:tc>
+        <w:tc>
+          <w:tcPr>
+            <w:tcW w:w="5760" w:type="dxa"/>
+            <w:tcBorders>
+              <w:top w:val="nil"/>
+              <w:left w:val="nil"/>
+              <w:bottom w:val="nil"/>
+              <w:right w:val="nil"/>
+            </w:tcBorders>
+          </w:tcPr>
+          <w:p>
+            <w:pPr>
+              <w:rPr>
+                <w:rFonts w:ascii="Palatino Linotype" w:hAnsi="Palatino Linotype"/>
+                <w:lang w:val="en-US"/>
+              </w:rPr>
+            </w:pPr>
+            <w:r>
+              <w:rPr>
+                <w:rFonts w:ascii="Palatino Linotype" w:hAnsi="Palatino Linotype"/>
+                <w:lang w:val="en-US"/>
+              </w:rPr>
+              <w:t xml:space="preserve">Country expert for Norway, Online Job Advertisements (OJA), </w:t>
+            </w:r>
+            <w:hyperlink r:id="rId6" w:history="1">
+              <w:r>
+                <w:rPr>
+                  <w:rStyle w:val="Hyperlink"/>
+                  <w:rFonts w:ascii="Palatino Linotype" w:hAnsi="Palatino Linotype"/>
+                  <w:lang w:val="en-US"/>
+                </w:rPr>
+                <w:t>Eurostat Web Intelligence Hub (WIH).</w:t>
+              </w:r>
+            </w:hyperlink>
           </w:p>
         </w:tc>
       </w:tr>
@@ -1009,7 +1083,7 @@
               </w:rPr>
               <w:t xml:space="preserve">Working Paper: </w:t>
             </w:r>
-            <w:hyperlink r:id="rId6" w:history="1">
+            <w:hyperlink r:id="rId7" w:history="1">
               <w:r>
                 <w:rPr>
                   <w:rStyle w:val="Hyperlink"/>
@@ -1037,7 +1111,7 @@
               </w:rPr>
               <w:t xml:space="preserve">Dictionary of text analysis phrases: </w:t>
             </w:r>
-            <w:hyperlink r:id="rId7" w:history="1">
+            <w:hyperlink r:id="rId8" w:history="1">
               <w:r>
                 <w:rPr>
                   <w:rStyle w:val="Hyperlink"/>
@@ -1505,7 +1579,7 @@
                 <w:lang w:val="en-US"/>
               </w:rPr>
             </w:pPr>
-            <w:hyperlink r:id="rId8" w:history="1">
+            <w:hyperlink r:id="rId9" w:history="1">
               <w:r>
                 <w:rPr>
                   <w:rStyle w:val="Hyperlink"/>
@@ -2433,7 +2507,23 @@
                 <w:rFonts w:ascii="Palatino Linotype" w:hAnsi="Palatino Linotype"/>
                 <w:lang w:val="en-US"/>
               </w:rPr>
-              <w:t>, Moving Ahead with AI? Equitable Adaptation in School and Educational Transitions in the Nordic-Baltic Region (AHEAD), NordForsk, 2027–2029. PI: Kjell Gunnar Salvanes. Budget: NOK 1</w:t>
+              <w:t xml:space="preserve">, Moving Ahead with AI? Equitable Adaptation in School and Educational Transitions in the Nordic-Baltic Region (AHEAD), </w:t>
+            </w:r>
+            <w:proofErr w:type="spellStart"/>
+            <w:r>
+              <w:rPr>
+                <w:rFonts w:ascii="Palatino Linotype" w:hAnsi="Palatino Linotype"/>
+                <w:lang w:val="en-US"/>
+              </w:rPr>
+              <w:t>NordForsk</w:t>
+            </w:r>
+            <w:proofErr w:type="spellEnd"/>
+            <w:r>
+              <w:rPr>
+                <w:rFonts w:ascii="Palatino Linotype" w:hAnsi="Palatino Linotype"/>
+                <w:lang w:val="en-US"/>
+              </w:rPr>
+              <w:t>, 2027–2029. PI: Kjell Gunnar Salvanes. Budget: NOK 1</w:t>
             </w:r>
             <w:r>
               <w:rPr>
@@ -3087,12 +3177,21 @@
                 <w:lang w:val="en-US"/>
               </w:rPr>
             </w:pPr>
-            <w:r>
-              <w:rPr>
-                <w:rFonts w:ascii="Palatino Linotype" w:hAnsi="Palatino Linotype"/>
-                <w:lang w:val="en-US"/>
-              </w:rPr>
-              <w:t>CESifo / Junior Workshop on the Economics of Education</w:t>
+            <w:proofErr w:type="spellStart"/>
+            <w:r>
+              <w:rPr>
+                <w:rFonts w:ascii="Palatino Linotype" w:hAnsi="Palatino Linotype"/>
+                <w:lang w:val="en-US"/>
+              </w:rPr>
+              <w:t>CESifo</w:t>
+            </w:r>
+            <w:proofErr w:type="spellEnd"/>
+            <w:r>
+              <w:rPr>
+                <w:rFonts w:ascii="Palatino Linotype" w:hAnsi="Palatino Linotype"/>
+                <w:lang w:val="en-US"/>
+              </w:rPr>
+              <w:t xml:space="preserve"> / Junior Workshop on the Economics of Education</w:t>
             </w:r>
           </w:p>
         </w:tc>
@@ -3622,7 +3721,8 @@
           <w:lang w:val="en-US"/>
         </w:rPr>
       </w:pPr>
-      <w:hyperlink r:id="rId9" w:history="1">
+      <w:hyperlink r:id="rId10" w:history="1">
+        <w:proofErr w:type="spellStart"/>
         <w:r>
           <w:rPr>
             <w:rStyle w:val="Hyperlink"/>
@@ -3633,6 +3733,7 @@
           </w:rPr>
           <w:t>Statapar</w:t>
         </w:r>
+        <w:proofErr w:type="spellEnd"/>
       </w:hyperlink>
       <w:r>
         <w:rPr>
@@ -3649,7 +3750,8 @@
           <w:lang w:val="en-US"/>
         </w:rPr>
       </w:pPr>
-      <w:hyperlink r:id="rId10" w:history="1">
+      <w:hyperlink r:id="rId11" w:history="1">
+        <w:proofErr w:type="spellStart"/>
         <w:r>
           <w:rPr>
             <w:rStyle w:val="Hyperlink"/>
@@ -3660,6 +3762,7 @@
           </w:rPr>
           <w:t>Statex</w:t>
         </w:r>
+        <w:proofErr w:type="spellEnd"/>
       </w:hyperlink>
       <w:r>
         <w:rPr>
@@ -3776,14 +3879,32 @@
           <w:lang w:val="en-US"/>
         </w:rPr>
       </w:pPr>
-      <w:hyperlink r:id="rId11" w:history="1">
+      <w:hyperlink r:id="rId12" w:history="1">
         <w:r>
           <w:rPr>
             <w:rStyle w:val="Hyperlink"/>
             <w:rFonts w:ascii="Palatino Linotype" w:hAnsi="Palatino Linotype"/>
             <w:lang w:val="en-US"/>
           </w:rPr>
-          <w:t>Dagens Næringsliv, 2021.</w:t>
+          <w:t xml:space="preserve">Dagens </w:t>
+        </w:r>
+        <w:proofErr w:type="spellStart"/>
+        <w:r>
+          <w:rPr>
+            <w:rStyle w:val="Hyperlink"/>
+            <w:rFonts w:ascii="Palatino Linotype" w:hAnsi="Palatino Linotype"/>
+            <w:lang w:val="en-US"/>
+          </w:rPr>
+          <w:t>Næringsliv</w:t>
+        </w:r>
+        <w:proofErr w:type="spellEnd"/>
+        <w:r>
+          <w:rPr>
+            <w:rStyle w:val="Hyperlink"/>
+            <w:rFonts w:ascii="Palatino Linotype" w:hAnsi="Palatino Linotype"/>
+            <w:lang w:val="en-US"/>
+          </w:rPr>
+          <w:t>, 2021.</w:t>
         </w:r>
       </w:hyperlink>
     </w:p>
@@ -4711,7 +4832,6 @@
   <w:style w:type="character" w:default="1" w:styleId="DefaultParagraphFont">
     <w:name w:val="Default Paragraph Font"/>
     <w:uiPriority w:val="1"/>
-    <w:semiHidden/>
     <w:unhideWhenUsed/>
   </w:style>
   <w:style w:type="table" w:default="1" w:styleId="TableNormal">

</xml_diff>

<commit_message>
Add conference in Bonn to CV and adjust the UIB presentation date
</commit_message>
<xml_diff>
--- a/files/CV_Adam_Reiremo.docx
+++ b/files/CV_Adam_Reiremo.docx
@@ -84,12 +84,21 @@
                 <w:lang w:val="en-US"/>
               </w:rPr>
             </w:pPr>
-            <w:r>
-              <w:rPr>
-                <w:rFonts w:ascii="Palatino Linotype" w:hAnsi="Palatino Linotype"/>
-                <w:lang w:val="en-US"/>
-              </w:rPr>
-              <w:t>Helleveien 30</w:t>
+            <w:proofErr w:type="spellStart"/>
+            <w:r>
+              <w:rPr>
+                <w:rFonts w:ascii="Palatino Linotype" w:hAnsi="Palatino Linotype"/>
+                <w:lang w:val="en-US"/>
+              </w:rPr>
+              <w:t>Helleveien</w:t>
+            </w:r>
+            <w:proofErr w:type="spellEnd"/>
+            <w:r>
+              <w:rPr>
+                <w:rFonts w:ascii="Palatino Linotype" w:hAnsi="Palatino Linotype"/>
+                <w:lang w:val="en-US"/>
+              </w:rPr>
+              <w:t xml:space="preserve"> 30</w:t>
             </w:r>
           </w:p>
           <w:p>
@@ -1442,7 +1451,23 @@
           <w:rFonts w:ascii="Palatino Linotype" w:hAnsi="Palatino Linotype"/>
           <w:lang w:val="en-US"/>
         </w:rPr>
-        <w:t xml:space="preserve"> With Lisa Kahn and Alexander L. P. Willén</w:t>
+        <w:t xml:space="preserve"> </w:t>
+      </w:r>
+      <w:proofErr w:type="gramStart"/>
+      <w:r>
+        <w:rPr>
+          <w:rFonts w:ascii="Palatino Linotype" w:hAnsi="Palatino Linotype"/>
+          <w:lang w:val="en-US"/>
+        </w:rPr>
+        <w:t>With</w:t>
+      </w:r>
+      <w:proofErr w:type="gramEnd"/>
+      <w:r>
+        <w:rPr>
+          <w:rFonts w:ascii="Palatino Linotype" w:hAnsi="Palatino Linotype"/>
+          <w:lang w:val="en-US"/>
+        </w:rPr>
+        <w:t xml:space="preserve"> Lisa Kahn and Alexander L. P. Willén</w:t>
       </w:r>
     </w:p>
     <w:p>
@@ -2526,7 +2551,23 @@
                 <w:rFonts w:ascii="Palatino Linotype" w:hAnsi="Palatino Linotype"/>
                 <w:lang w:val="en-US"/>
               </w:rPr>
-              <w:t>, Moving Ahead with AI? Equitable Adaptation in School and Educational Transitions in the Nordic-Baltic Region (AHEAD), NordForsk, 2027–2029. PI: Kjell Gunnar Salvanes. Budget: NOK 1</w:t>
+              <w:t xml:space="preserve">, Moving Ahead with AI? Equitable Adaptation in School and Educational Transitions in the Nordic-Baltic Region (AHEAD), </w:t>
+            </w:r>
+            <w:proofErr w:type="spellStart"/>
+            <w:r>
+              <w:rPr>
+                <w:rFonts w:ascii="Palatino Linotype" w:hAnsi="Palatino Linotype"/>
+                <w:lang w:val="en-US"/>
+              </w:rPr>
+              <w:t>NordForsk</w:t>
+            </w:r>
+            <w:proofErr w:type="spellEnd"/>
+            <w:r>
+              <w:rPr>
+                <w:rFonts w:ascii="Palatino Linotype" w:hAnsi="Palatino Linotype"/>
+                <w:lang w:val="en-US"/>
+              </w:rPr>
+              <w:t>, 2027–2029. PI: Kjell Gunnar Salvanes. Budget: NOK 1</w:t>
             </w:r>
             <w:r>
               <w:rPr>
@@ -2610,7 +2651,25 @@
                 <w:bCs/>
                 <w:lang w:val="en-US"/>
               </w:rPr>
-              <w:t xml:space="preserve">leading </w:t>
+              <w:t>lead</w:t>
+            </w:r>
+            <w:r>
+              <w:rPr>
+                <w:rFonts w:ascii="Palatino Linotype" w:hAnsi="Palatino Linotype"/>
+                <w:b/>
+                <w:bCs/>
+                <w:lang w:val="en-US"/>
+              </w:rPr>
+              <w:t>er of</w:t>
+            </w:r>
+            <w:r>
+              <w:rPr>
+                <w:rFonts w:ascii="Palatino Linotype" w:hAnsi="Palatino Linotype"/>
+                <w:b/>
+                <w:bCs/>
+                <w:lang w:val="en-US"/>
+              </w:rPr>
+              <w:t xml:space="preserve"> </w:t>
             </w:r>
             <w:r>
               <w:rPr>
@@ -2743,6 +2802,15 @@
           <w:lang w:val="en-US"/>
         </w:rPr>
         <w:t>Presentations</w:t>
+      </w:r>
+      <w:r>
+        <w:rPr>
+          <w:rFonts w:ascii="Palatino Linotype" w:hAnsi="Palatino Linotype"/>
+          <w:b/>
+          <w:bCs/>
+          <w:lang w:val="en-US"/>
+        </w:rPr>
+        <w:t xml:space="preserve"> (including future presentations)</w:t>
       </w:r>
     </w:p>
     <w:tbl>
@@ -2760,13 +2828,13 @@
         <w:tblLook w:val="04A0" w:firstRow="1" w:lastRow="0" w:firstColumn="1" w:lastColumn="0" w:noHBand="0" w:noVBand="1"/>
       </w:tblPr>
       <w:tblGrid>
-        <w:gridCol w:w="1134"/>
-        <w:gridCol w:w="7882"/>
+        <w:gridCol w:w="851"/>
+        <w:gridCol w:w="8165"/>
       </w:tblGrid>
       <w:tr>
         <w:tc>
           <w:tcPr>
-            <w:tcW w:w="1134" w:type="dxa"/>
+            <w:tcW w:w="851" w:type="dxa"/>
           </w:tcPr>
           <w:p>
             <w:pPr>
@@ -2787,7 +2855,7 @@
         </w:tc>
         <w:tc>
           <w:tcPr>
-            <w:tcW w:w="7882" w:type="dxa"/>
+            <w:tcW w:w="8165" w:type="dxa"/>
           </w:tcPr>
           <w:p>
             <w:pPr>
@@ -2806,21 +2874,58 @@
                 <w:rFonts w:ascii="Palatino Linotype" w:hAnsi="Palatino Linotype"/>
                 <w:lang w:val="en-US"/>
               </w:rPr>
-              <w:t>University of Bergen, department seminar (Sept</w:t>
-            </w:r>
-            <w:r>
-              <w:rPr>
-                <w:rFonts w:ascii="Palatino Linotype" w:hAnsi="Palatino Linotype"/>
-                <w:lang w:val="en-US"/>
-              </w:rPr>
-              <w:t>ember 29,</w:t>
-            </w:r>
-            <w:r>
-              <w:rPr>
-                <w:rFonts w:ascii="Palatino Linotype" w:hAnsi="Palatino Linotype"/>
-                <w:lang w:val="en-US"/>
-              </w:rPr>
-              <w:t xml:space="preserve"> by invitation)</w:t>
+              <w:t>Workshop on Human Capital and Education</w:t>
+            </w:r>
+            <w:r>
+              <w:rPr>
+                <w:rFonts w:ascii="Palatino Linotype" w:hAnsi="Palatino Linotype"/>
+                <w:lang w:val="en-US"/>
+              </w:rPr>
+              <w:t xml:space="preserve"> organized by </w:t>
+            </w:r>
+            <w:r>
+              <w:rPr>
+                <w:rFonts w:ascii="Palatino Linotype" w:hAnsi="Palatino Linotype"/>
+                <w:lang w:val="en-US"/>
+              </w:rPr>
+              <w:t>Max Planck Institute for Behavioral Economics</w:t>
+            </w:r>
+            <w:r>
+              <w:rPr>
+                <w:rFonts w:ascii="Palatino Linotype" w:hAnsi="Palatino Linotype"/>
+                <w:lang w:val="en-US"/>
+              </w:rPr>
+              <w:t xml:space="preserve"> and </w:t>
+            </w:r>
+            <w:proofErr w:type="spellStart"/>
+            <w:r>
+              <w:rPr>
+                <w:rFonts w:ascii="Palatino Linotype" w:hAnsi="Palatino Linotype"/>
+                <w:lang w:val="en-US"/>
+              </w:rPr>
+              <w:t>ECONtribute</w:t>
+            </w:r>
+            <w:proofErr w:type="spellEnd"/>
+            <w:r>
+              <w:rPr>
+                <w:rFonts w:ascii="Palatino Linotype" w:hAnsi="Palatino Linotype"/>
+                <w:lang w:val="en-US"/>
+              </w:rPr>
+              <w:t xml:space="preserve"> in Bonn (October 1</w:t>
+            </w:r>
+            <w:r>
+              <w:rPr>
+                <w:rFonts w:ascii="Palatino Linotype" w:hAnsi="Palatino Linotype"/>
+                <w:lang w:val="en-US"/>
+              </w:rPr>
+              <w:t xml:space="preserve"> &amp; </w:t>
+            </w:r>
+            <w:r>
+              <w:rPr>
+                <w:rFonts w:ascii="Palatino Linotype" w:hAnsi="Palatino Linotype"/>
+                <w:lang w:val="en-US"/>
+              </w:rPr>
+              <w:t>2)</w:t>
             </w:r>
           </w:p>
           <w:p>
@@ -2840,44 +2945,37 @@
                 <w:rFonts w:ascii="Palatino Linotype" w:hAnsi="Palatino Linotype"/>
                 <w:lang w:val="en-US"/>
               </w:rPr>
-              <w:t>Norwegian School of Economics / FAIR (brown bag seminar</w:t>
-            </w:r>
-            <w:r>
-              <w:rPr>
-                <w:rFonts w:ascii="Palatino Linotype" w:hAnsi="Palatino Linotype"/>
-                <w:lang w:val="en-US"/>
-              </w:rPr>
-              <w:t>)</w:t>
-            </w:r>
-          </w:p>
-        </w:tc>
-      </w:tr>
-      <w:tr>
-        <w:tc>
-          <w:tcPr>
-            <w:tcW w:w="1134" w:type="dxa"/>
-          </w:tcPr>
-          <w:p>
-            <w:pPr>
-              <w:jc w:val="right"/>
-              <w:rPr>
-                <w:rFonts w:ascii="Palatino Linotype" w:hAnsi="Palatino Linotype"/>
-                <w:lang w:val="en-US"/>
-              </w:rPr>
-            </w:pPr>
-            <w:r>
-              <w:rPr>
-                <w:rFonts w:ascii="Palatino Linotype" w:hAnsi="Palatino Linotype"/>
-                <w:lang w:val="en-US"/>
-              </w:rPr>
-              <w:t>2025</w:t>
-            </w:r>
-          </w:p>
-        </w:tc>
-        <w:tc>
-          <w:tcPr>
-            <w:tcW w:w="7882" w:type="dxa"/>
-          </w:tcPr>
+              <w:t>University of Bergen, department seminar (Sept</w:t>
+            </w:r>
+            <w:r>
+              <w:rPr>
+                <w:rFonts w:ascii="Palatino Linotype" w:hAnsi="Palatino Linotype"/>
+                <w:lang w:val="en-US"/>
+              </w:rPr>
+              <w:t>ember 2</w:t>
+            </w:r>
+            <w:r>
+              <w:rPr>
+                <w:rFonts w:ascii="Palatino Linotype" w:hAnsi="Palatino Linotype"/>
+                <w:lang w:val="en-US"/>
+              </w:rPr>
+              <w:t>5</w:t>
+            </w:r>
+            <w:r>
+              <w:rPr>
+                <w:rFonts w:ascii="Palatino Linotype" w:hAnsi="Palatino Linotype"/>
+                <w:lang w:val="en-US"/>
+              </w:rPr>
+              <w:t>,</w:t>
+            </w:r>
+            <w:r>
+              <w:rPr>
+                <w:rFonts w:ascii="Palatino Linotype" w:hAnsi="Palatino Linotype"/>
+                <w:lang w:val="en-US"/>
+              </w:rPr>
+              <w:t xml:space="preserve"> by invitation)</w:t>
+            </w:r>
+          </w:p>
           <w:p>
             <w:pPr>
               <w:pStyle w:val="ListParagraph"/>
@@ -2895,16 +2993,44 @@
                 <w:rFonts w:ascii="Palatino Linotype" w:hAnsi="Palatino Linotype"/>
                 <w:lang w:val="en-US"/>
               </w:rPr>
-              <w:t>NBER Summer Institute; Children and Families</w:t>
-            </w:r>
-            <w:r>
-              <w:rPr>
-                <w:rFonts w:ascii="Palatino Linotype" w:hAnsi="Palatino Linotype"/>
-                <w:lang w:val="en-US"/>
-              </w:rPr>
-              <w:t xml:space="preserve"> (presented by Jason Cook)</w:t>
-            </w:r>
-          </w:p>
+              <w:t>Norwegian School of Economics / FAIR (brown bag seminar</w:t>
+            </w:r>
+            <w:r>
+              <w:rPr>
+                <w:rFonts w:ascii="Palatino Linotype" w:hAnsi="Palatino Linotype"/>
+                <w:lang w:val="en-US"/>
+              </w:rPr>
+              <w:t>)</w:t>
+            </w:r>
+          </w:p>
+        </w:tc>
+      </w:tr>
+      <w:tr>
+        <w:tc>
+          <w:tcPr>
+            <w:tcW w:w="851" w:type="dxa"/>
+          </w:tcPr>
+          <w:p>
+            <w:pPr>
+              <w:jc w:val="right"/>
+              <w:rPr>
+                <w:rFonts w:ascii="Palatino Linotype" w:hAnsi="Palatino Linotype"/>
+                <w:lang w:val="en-US"/>
+              </w:rPr>
+            </w:pPr>
+            <w:r>
+              <w:rPr>
+                <w:rFonts w:ascii="Palatino Linotype" w:hAnsi="Palatino Linotype"/>
+                <w:lang w:val="en-US"/>
+              </w:rPr>
+              <w:t>2025</w:t>
+            </w:r>
+          </w:p>
+        </w:tc>
+        <w:tc>
+          <w:tcPr>
+            <w:tcW w:w="8165" w:type="dxa"/>
+          </w:tcPr>
           <w:p>
             <w:pPr>
               <w:pStyle w:val="ListParagraph"/>
@@ -2922,7 +3048,14 @@
                 <w:rFonts w:ascii="Palatino Linotype" w:hAnsi="Palatino Linotype"/>
                 <w:lang w:val="en-US"/>
               </w:rPr>
-              <w:t>Norwegian School of Economics / FAIR (brown bag seminar)</w:t>
+              <w:t>NBER Summer Institute; Children and Families</w:t>
+            </w:r>
+            <w:r>
+              <w:rPr>
+                <w:rFonts w:ascii="Palatino Linotype" w:hAnsi="Palatino Linotype"/>
+                <w:lang w:val="en-US"/>
+              </w:rPr>
+              <w:t xml:space="preserve"> (presented by Jason Cook)</w:t>
             </w:r>
           </w:p>
           <w:p>
@@ -2942,44 +3075,9 @@
                 <w:rFonts w:ascii="Palatino Linotype" w:hAnsi="Palatino Linotype"/>
                 <w:lang w:val="en-US"/>
               </w:rPr>
-              <w:t>Nordic Institute for Studies in Innovation, Research and Education</w:t>
-            </w:r>
-            <w:r>
-              <w:rPr>
-                <w:rFonts w:ascii="Palatino Linotype" w:hAnsi="Palatino Linotype"/>
-                <w:lang w:val="en-US"/>
-              </w:rPr>
-              <w:t xml:space="preserve">/NIFU (by invitation) </w:t>
-            </w:r>
-          </w:p>
-        </w:tc>
-      </w:tr>
-      <w:tr>
-        <w:tc>
-          <w:tcPr>
-            <w:tcW w:w="1134" w:type="dxa"/>
-          </w:tcPr>
-          <w:p>
-            <w:pPr>
-              <w:jc w:val="right"/>
-              <w:rPr>
-                <w:rFonts w:ascii="Palatino Linotype" w:hAnsi="Palatino Linotype"/>
-                <w:lang w:val="en-US"/>
-              </w:rPr>
-            </w:pPr>
-            <w:r>
-              <w:rPr>
-                <w:rFonts w:ascii="Palatino Linotype" w:hAnsi="Palatino Linotype"/>
-                <w:lang w:val="en-US"/>
-              </w:rPr>
-              <w:t>2024</w:t>
-            </w:r>
-          </w:p>
-        </w:tc>
-        <w:tc>
-          <w:tcPr>
-            <w:tcW w:w="7882" w:type="dxa"/>
-          </w:tcPr>
+              <w:t>Norwegian School of Economics / FAIR (brown bag seminar)</w:t>
+            </w:r>
+          </w:p>
           <w:p>
             <w:pPr>
               <w:pStyle w:val="ListParagraph"/>
@@ -2997,37 +3095,44 @@
                 <w:rFonts w:ascii="Palatino Linotype" w:hAnsi="Palatino Linotype"/>
                 <w:lang w:val="en-US"/>
               </w:rPr>
-              <w:t>Bank of Italy; Nontraditional Data, Machine Learning, and Natura</w:t>
-            </w:r>
-            <w:r>
-              <w:rPr>
-                <w:rFonts w:ascii="Palatino Linotype" w:hAnsi="Palatino Linotype"/>
-                <w:lang w:val="en-US"/>
-              </w:rPr>
-              <w:t>l</w:t>
-            </w:r>
-            <w:r>
-              <w:rPr>
-                <w:rFonts w:ascii="Palatino Linotype" w:hAnsi="Palatino Linotype"/>
-                <w:lang w:val="en-US"/>
-              </w:rPr>
-              <w:t xml:space="preserve"> </w:t>
-            </w:r>
-            <w:r>
-              <w:rPr>
-                <w:rFonts w:ascii="Palatino Linotype" w:hAnsi="Palatino Linotype"/>
-                <w:lang w:val="en-US"/>
-              </w:rPr>
-              <w:t>Language Processing for Macroeconomics</w:t>
-            </w:r>
-            <w:r>
-              <w:rPr>
-                <w:rFonts w:ascii="Palatino Linotype" w:hAnsi="Palatino Linotype"/>
-                <w:lang w:val="en-US"/>
-              </w:rPr>
-              <w:t xml:space="preserve"> </w:t>
-            </w:r>
-          </w:p>
+              <w:t>Nordic Institute for Studies in Innovation, Research and Education</w:t>
+            </w:r>
+            <w:r>
+              <w:rPr>
+                <w:rFonts w:ascii="Palatino Linotype" w:hAnsi="Palatino Linotype"/>
+                <w:lang w:val="en-US"/>
+              </w:rPr>
+              <w:t xml:space="preserve">/NIFU (by invitation) </w:t>
+            </w:r>
+          </w:p>
+        </w:tc>
+      </w:tr>
+      <w:tr>
+        <w:tc>
+          <w:tcPr>
+            <w:tcW w:w="851" w:type="dxa"/>
+          </w:tcPr>
+          <w:p>
+            <w:pPr>
+              <w:jc w:val="right"/>
+              <w:rPr>
+                <w:rFonts w:ascii="Palatino Linotype" w:hAnsi="Palatino Linotype"/>
+                <w:lang w:val="en-US"/>
+              </w:rPr>
+            </w:pPr>
+            <w:r>
+              <w:rPr>
+                <w:rFonts w:ascii="Palatino Linotype" w:hAnsi="Palatino Linotype"/>
+                <w:lang w:val="en-US"/>
+              </w:rPr>
+              <w:t>2024</w:t>
+            </w:r>
+          </w:p>
+        </w:tc>
+        <w:tc>
+          <w:tcPr>
+            <w:tcW w:w="8165" w:type="dxa"/>
+          </w:tcPr>
           <w:p>
             <w:pPr>
               <w:pStyle w:val="ListParagraph"/>
@@ -3045,7 +3150,35 @@
                 <w:rFonts w:ascii="Palatino Linotype" w:hAnsi="Palatino Linotype"/>
                 <w:lang w:val="en-US"/>
               </w:rPr>
-              <w:t>Norwegian School of Economics / FAIR (brown bag seminar)</w:t>
+              <w:t>Bank of Italy; Nontraditional Data, Machine Learning, and Natura</w:t>
+            </w:r>
+            <w:r>
+              <w:rPr>
+                <w:rFonts w:ascii="Palatino Linotype" w:hAnsi="Palatino Linotype"/>
+                <w:lang w:val="en-US"/>
+              </w:rPr>
+              <w:t>l</w:t>
+            </w:r>
+            <w:r>
+              <w:rPr>
+                <w:rFonts w:ascii="Palatino Linotype" w:hAnsi="Palatino Linotype"/>
+                <w:lang w:val="en-US"/>
+              </w:rPr>
+              <w:t xml:space="preserve"> </w:t>
+            </w:r>
+            <w:r>
+              <w:rPr>
+                <w:rFonts w:ascii="Palatino Linotype" w:hAnsi="Palatino Linotype"/>
+                <w:lang w:val="en-US"/>
+              </w:rPr>
+              <w:t>Language Processing for Macroeconomics</w:t>
+            </w:r>
+            <w:r>
+              <w:rPr>
+                <w:rFonts w:ascii="Palatino Linotype" w:hAnsi="Palatino Linotype"/>
+                <w:lang w:val="en-US"/>
+              </w:rPr>
+              <w:t xml:space="preserve"> </w:t>
             </w:r>
           </w:p>
           <w:p>
@@ -3065,21 +3198,7 @@
                 <w:rFonts w:ascii="Palatino Linotype" w:hAnsi="Palatino Linotype"/>
                 <w:lang w:val="en-US"/>
               </w:rPr>
-              <w:t>University of Oslo</w:t>
-            </w:r>
-            <w:r>
-              <w:rPr>
-                <w:rFonts w:ascii="Palatino Linotype" w:hAnsi="Palatino Linotype"/>
-                <w:lang w:val="en-US"/>
-              </w:rPr>
-              <w:t>, Department Seminar</w:t>
-            </w:r>
-            <w:r>
-              <w:rPr>
-                <w:rFonts w:ascii="Palatino Linotype" w:hAnsi="Palatino Linotype"/>
-                <w:lang w:val="en-US"/>
-              </w:rPr>
-              <w:t xml:space="preserve"> </w:t>
+              <w:t>Norwegian School of Economics / FAIR (brown bag seminar)</w:t>
             </w:r>
           </w:p>
           <w:p>
@@ -3099,44 +3218,23 @@
                 <w:rFonts w:ascii="Palatino Linotype" w:hAnsi="Palatino Linotype"/>
                 <w:lang w:val="en-US"/>
               </w:rPr>
-              <w:t>University of Oslo; Workshop; The Demand and Supply of Public Education</w:t>
-            </w:r>
-            <w:r>
-              <w:rPr>
-                <w:rFonts w:ascii="Palatino Linotype" w:hAnsi="Palatino Linotype"/>
-                <w:lang w:val="en-US"/>
-              </w:rPr>
-              <w:t xml:space="preserve"> (by invitation)</w:t>
-            </w:r>
-          </w:p>
-        </w:tc>
-      </w:tr>
-      <w:tr>
-        <w:tc>
-          <w:tcPr>
-            <w:tcW w:w="1134" w:type="dxa"/>
-          </w:tcPr>
-          <w:p>
-            <w:pPr>
-              <w:jc w:val="right"/>
-              <w:rPr>
-                <w:rFonts w:ascii="Palatino Linotype" w:hAnsi="Palatino Linotype"/>
-                <w:lang w:val="en-US"/>
-              </w:rPr>
-            </w:pPr>
-            <w:r>
-              <w:rPr>
-                <w:rFonts w:ascii="Palatino Linotype" w:hAnsi="Palatino Linotype"/>
-                <w:lang w:val="en-US"/>
-              </w:rPr>
-              <w:t>2023</w:t>
-            </w:r>
-          </w:p>
-        </w:tc>
-        <w:tc>
-          <w:tcPr>
-            <w:tcW w:w="7882" w:type="dxa"/>
-          </w:tcPr>
+              <w:t>University of Oslo</w:t>
+            </w:r>
+            <w:r>
+              <w:rPr>
+                <w:rFonts w:ascii="Palatino Linotype" w:hAnsi="Palatino Linotype"/>
+                <w:lang w:val="en-US"/>
+              </w:rPr>
+              <w:t>, Department Seminar</w:t>
+            </w:r>
+            <w:r>
+              <w:rPr>
+                <w:rFonts w:ascii="Palatino Linotype" w:hAnsi="Palatino Linotype"/>
+                <w:lang w:val="en-US"/>
+              </w:rPr>
+              <w:t xml:space="preserve"> </w:t>
+            </w:r>
+          </w:p>
           <w:p>
             <w:pPr>
               <w:pStyle w:val="ListParagraph"/>
@@ -3154,7 +3252,14 @@
                 <w:rFonts w:ascii="Palatino Linotype" w:hAnsi="Palatino Linotype"/>
                 <w:lang w:val="en-US"/>
               </w:rPr>
-              <w:t>CESifo / Junior Workshop on the Economics of Education</w:t>
+              <w:t>University of Oslo; Workshop; The Demand and Supply of Public Education</w:t>
+            </w:r>
+            <w:r>
+              <w:rPr>
+                <w:rFonts w:ascii="Palatino Linotype" w:hAnsi="Palatino Linotype"/>
+                <w:lang w:val="en-US"/>
+              </w:rPr>
+              <w:t xml:space="preserve"> (by invitation)</w:t>
             </w:r>
           </w:p>
         </w:tc>
@@ -3162,7 +3267,7 @@
       <w:tr>
         <w:tc>
           <w:tcPr>
-            <w:tcW w:w="1134" w:type="dxa"/>
+            <w:tcW w:w="851" w:type="dxa"/>
           </w:tcPr>
           <w:p>
             <w:pPr>
@@ -3183,7 +3288,7 @@
         </w:tc>
         <w:tc>
           <w:tcPr>
-            <w:tcW w:w="7882" w:type="dxa"/>
+            <w:tcW w:w="8165" w:type="dxa"/>
           </w:tcPr>
           <w:p>
             <w:pPr>
@@ -3197,40 +3302,21 @@
                 <w:lang w:val="en-US"/>
               </w:rPr>
             </w:pPr>
-            <w:r>
-              <w:rPr>
-                <w:rFonts w:ascii="Palatino Linotype" w:hAnsi="Palatino Linotype"/>
-                <w:lang w:val="en-US"/>
-              </w:rPr>
-              <w:t>University of Oslo</w:t>
-            </w:r>
-            <w:r>
-              <w:rPr>
-                <w:rFonts w:ascii="Palatino Linotype" w:hAnsi="Palatino Linotype"/>
-                <w:lang w:val="en-US"/>
-              </w:rPr>
-              <w:t>;</w:t>
-            </w:r>
-            <w:r>
-              <w:rPr>
-                <w:rFonts w:ascii="Palatino Linotype" w:hAnsi="Palatino Linotype"/>
-                <w:lang w:val="en-US"/>
-              </w:rPr>
-              <w:t xml:space="preserve"> PhD Workshop</w:t>
-            </w:r>
-            <w:r>
-              <w:rPr>
-                <w:rFonts w:ascii="Palatino Linotype" w:hAnsi="Palatino Linotype"/>
-                <w:lang w:val="en-US"/>
-              </w:rPr>
-              <w:t>;</w:t>
-            </w:r>
-            <w:r>
-              <w:rPr>
-                <w:rFonts w:ascii="Palatino Linotype" w:hAnsi="Palatino Linotype"/>
-                <w:lang w:val="en-US"/>
-              </w:rPr>
-              <w:t xml:space="preserve"> Oslo PhD Initiative in Economic</w:t>
+            <w:proofErr w:type="spellStart"/>
+            <w:r>
+              <w:rPr>
+                <w:rFonts w:ascii="Palatino Linotype" w:hAnsi="Palatino Linotype"/>
+                <w:lang w:val="en-US"/>
+              </w:rPr>
+              <w:t>CESifo</w:t>
+            </w:r>
+            <w:proofErr w:type="spellEnd"/>
+            <w:r>
+              <w:rPr>
+                <w:rFonts w:ascii="Palatino Linotype" w:hAnsi="Palatino Linotype"/>
+                <w:lang w:val="en-US"/>
+              </w:rPr>
+              <w:t xml:space="preserve"> / Junior Workshop on the Economics of Education</w:t>
             </w:r>
           </w:p>
         </w:tc>
@@ -3238,7 +3324,7 @@
       <w:tr>
         <w:tc>
           <w:tcPr>
-            <w:tcW w:w="1134" w:type="dxa"/>
+            <w:tcW w:w="851" w:type="dxa"/>
           </w:tcPr>
           <w:p>
             <w:pPr>
@@ -3253,13 +3339,13 @@
                 <w:rFonts w:ascii="Palatino Linotype" w:hAnsi="Palatino Linotype"/>
                 <w:lang w:val="en-US"/>
               </w:rPr>
-              <w:t>2022</w:t>
-            </w:r>
-          </w:p>
-        </w:tc>
-        <w:tc>
-          <w:tcPr>
-            <w:tcW w:w="7882" w:type="dxa"/>
+              <w:t>2023</w:t>
+            </w:r>
+          </w:p>
+        </w:tc>
+        <w:tc>
+          <w:tcPr>
+            <w:tcW w:w="8165" w:type="dxa"/>
           </w:tcPr>
           <w:p>
             <w:pPr>
@@ -3278,14 +3364,35 @@
                 <w:rFonts w:ascii="Palatino Linotype" w:hAnsi="Palatino Linotype"/>
                 <w:lang w:val="en-US"/>
               </w:rPr>
-              <w:t>University of Oslo; Workshop; The Demand and Supply of Public Education</w:t>
-            </w:r>
-            <w:r>
-              <w:rPr>
-                <w:rFonts w:ascii="Palatino Linotype" w:hAnsi="Palatino Linotype"/>
-                <w:lang w:val="en-US"/>
-              </w:rPr>
-              <w:t xml:space="preserve"> (by invitation)</w:t>
+              <w:t>University of Oslo</w:t>
+            </w:r>
+            <w:r>
+              <w:rPr>
+                <w:rFonts w:ascii="Palatino Linotype" w:hAnsi="Palatino Linotype"/>
+                <w:lang w:val="en-US"/>
+              </w:rPr>
+              <w:t>;</w:t>
+            </w:r>
+            <w:r>
+              <w:rPr>
+                <w:rFonts w:ascii="Palatino Linotype" w:hAnsi="Palatino Linotype"/>
+                <w:lang w:val="en-US"/>
+              </w:rPr>
+              <w:t xml:space="preserve"> PhD Workshop</w:t>
+            </w:r>
+            <w:r>
+              <w:rPr>
+                <w:rFonts w:ascii="Palatino Linotype" w:hAnsi="Palatino Linotype"/>
+                <w:lang w:val="en-US"/>
+              </w:rPr>
+              <w:t>;</w:t>
+            </w:r>
+            <w:r>
+              <w:rPr>
+                <w:rFonts w:ascii="Palatino Linotype" w:hAnsi="Palatino Linotype"/>
+                <w:lang w:val="en-US"/>
+              </w:rPr>
+              <w:t xml:space="preserve"> Oslo PhD Initiative in Economic</w:t>
             </w:r>
           </w:p>
         </w:tc>
@@ -3293,7 +3400,7 @@
       <w:tr>
         <w:tc>
           <w:tcPr>
-            <w:tcW w:w="1134" w:type="dxa"/>
+            <w:tcW w:w="851" w:type="dxa"/>
           </w:tcPr>
           <w:p>
             <w:pPr>
@@ -3308,20 +3415,13 @@
                 <w:rFonts w:ascii="Palatino Linotype" w:hAnsi="Palatino Linotype"/>
                 <w:lang w:val="en-US"/>
               </w:rPr>
-              <w:t>202</w:t>
-            </w:r>
-            <w:r>
-              <w:rPr>
-                <w:rFonts w:ascii="Palatino Linotype" w:hAnsi="Palatino Linotype"/>
-                <w:lang w:val="en-US"/>
-              </w:rPr>
-              <w:t>2</w:t>
-            </w:r>
-          </w:p>
-        </w:tc>
-        <w:tc>
-          <w:tcPr>
-            <w:tcW w:w="7882" w:type="dxa"/>
+              <w:t>2022</w:t>
+            </w:r>
+          </w:p>
+        </w:tc>
+        <w:tc>
+          <w:tcPr>
+            <w:tcW w:w="8165" w:type="dxa"/>
           </w:tcPr>
           <w:p>
             <w:pPr>
@@ -3340,7 +3440,14 @@
                 <w:rFonts w:ascii="Palatino Linotype" w:hAnsi="Palatino Linotype"/>
                 <w:lang w:val="en-US"/>
               </w:rPr>
-              <w:t>University of Oslo; PhD Workshop; Oslo PhD Initiative in Economic</w:t>
+              <w:t>University of Oslo; Workshop; The Demand and Supply of Public Education</w:t>
+            </w:r>
+            <w:r>
+              <w:rPr>
+                <w:rFonts w:ascii="Palatino Linotype" w:hAnsi="Palatino Linotype"/>
+                <w:lang w:val="en-US"/>
+              </w:rPr>
+              <w:t xml:space="preserve"> (by invitation)</w:t>
             </w:r>
           </w:p>
         </w:tc>
@@ -3348,7 +3455,7 @@
       <w:tr>
         <w:tc>
           <w:tcPr>
-            <w:tcW w:w="1134" w:type="dxa"/>
+            <w:tcW w:w="851" w:type="dxa"/>
           </w:tcPr>
           <w:p>
             <w:pPr>
@@ -3363,13 +3470,20 @@
                 <w:rFonts w:ascii="Palatino Linotype" w:hAnsi="Palatino Linotype"/>
                 <w:lang w:val="en-US"/>
               </w:rPr>
-              <w:t>2022</w:t>
-            </w:r>
-          </w:p>
-        </w:tc>
-        <w:tc>
-          <w:tcPr>
-            <w:tcW w:w="7882" w:type="dxa"/>
+              <w:t>202</w:t>
+            </w:r>
+            <w:r>
+              <w:rPr>
+                <w:rFonts w:ascii="Palatino Linotype" w:hAnsi="Palatino Linotype"/>
+                <w:lang w:val="en-US"/>
+              </w:rPr>
+              <w:t>2</w:t>
+            </w:r>
+          </w:p>
+        </w:tc>
+        <w:tc>
+          <w:tcPr>
+            <w:tcW w:w="8165" w:type="dxa"/>
           </w:tcPr>
           <w:p>
             <w:pPr>
@@ -3388,6 +3502,54 @@
                 <w:rFonts w:ascii="Palatino Linotype" w:hAnsi="Palatino Linotype"/>
                 <w:lang w:val="en-US"/>
               </w:rPr>
+              <w:t>University of Oslo; PhD Workshop; Oslo PhD Initiative in Economic</w:t>
+            </w:r>
+          </w:p>
+        </w:tc>
+      </w:tr>
+      <w:tr>
+        <w:tc>
+          <w:tcPr>
+            <w:tcW w:w="851" w:type="dxa"/>
+          </w:tcPr>
+          <w:p>
+            <w:pPr>
+              <w:jc w:val="right"/>
+              <w:rPr>
+                <w:rFonts w:ascii="Palatino Linotype" w:hAnsi="Palatino Linotype"/>
+                <w:lang w:val="en-US"/>
+              </w:rPr>
+            </w:pPr>
+            <w:r>
+              <w:rPr>
+                <w:rFonts w:ascii="Palatino Linotype" w:hAnsi="Palatino Linotype"/>
+                <w:lang w:val="en-US"/>
+              </w:rPr>
+              <w:t>2022</w:t>
+            </w:r>
+          </w:p>
+        </w:tc>
+        <w:tc>
+          <w:tcPr>
+            <w:tcW w:w="8165" w:type="dxa"/>
+          </w:tcPr>
+          <w:p>
+            <w:pPr>
+              <w:pStyle w:val="ListParagraph"/>
+              <w:numPr>
+                <w:ilvl w:val="0"/>
+                <w:numId w:val="2"/>
+              </w:numPr>
+              <w:rPr>
+                <w:rFonts w:ascii="Palatino Linotype" w:hAnsi="Palatino Linotype"/>
+                <w:lang w:val="en-US"/>
+              </w:rPr>
+            </w:pPr>
+            <w:r>
+              <w:rPr>
+                <w:rFonts w:ascii="Palatino Linotype" w:hAnsi="Palatino Linotype"/>
+                <w:lang w:val="en-US"/>
+              </w:rPr>
               <w:t>Lund University; PhD Workshop in the Economics of Education</w:t>
             </w:r>
           </w:p>
@@ -3399,7 +3561,7 @@
         </w:trPr>
         <w:tc>
           <w:tcPr>
-            <w:tcW w:w="1134" w:type="dxa"/>
+            <w:tcW w:w="851" w:type="dxa"/>
           </w:tcPr>
           <w:p>
             <w:pPr>
@@ -3420,7 +3582,7 @@
         </w:tc>
         <w:tc>
           <w:tcPr>
-            <w:tcW w:w="7882" w:type="dxa"/>
+            <w:tcW w:w="8165" w:type="dxa"/>
           </w:tcPr>
           <w:p>
             <w:pPr>
@@ -3673,6 +3835,7 @@
           <w:bCs/>
           <w:lang w:val="en-US"/>
         </w:rPr>
+        <w:lastRenderedPageBreak/>
         <w:t>Software Packages</w:t>
       </w:r>
     </w:p>
@@ -3684,6 +3847,7 @@
         </w:rPr>
       </w:pPr>
       <w:hyperlink r:id="rId10" w:history="1">
+        <w:proofErr w:type="spellStart"/>
         <w:r>
           <w:rPr>
             <w:rStyle w:val="Hyperlink"/>
@@ -3694,6 +3858,7 @@
           </w:rPr>
           <w:t>Statapar</w:t>
         </w:r>
+        <w:proofErr w:type="spellEnd"/>
       </w:hyperlink>
       <w:r>
         <w:rPr>
@@ -3711,6 +3876,7 @@
         </w:rPr>
       </w:pPr>
       <w:hyperlink r:id="rId11" w:history="1">
+        <w:proofErr w:type="spellStart"/>
         <w:r>
           <w:rPr>
             <w:rStyle w:val="Hyperlink"/>
@@ -3721,6 +3887,7 @@
           </w:rPr>
           <w:t>Statex</w:t>
         </w:r>
+        <w:proofErr w:type="spellEnd"/>
       </w:hyperlink>
       <w:r>
         <w:rPr>
@@ -3844,7 +4011,25 @@
             <w:rFonts w:ascii="Palatino Linotype" w:hAnsi="Palatino Linotype"/>
             <w:lang w:val="en-US"/>
           </w:rPr>
-          <w:t>Dagens Næringsliv, 2021.</w:t>
+          <w:t xml:space="preserve">Dagens </w:t>
+        </w:r>
+        <w:proofErr w:type="spellStart"/>
+        <w:r>
+          <w:rPr>
+            <w:rStyle w:val="Hyperlink"/>
+            <w:rFonts w:ascii="Palatino Linotype" w:hAnsi="Palatino Linotype"/>
+            <w:lang w:val="en-US"/>
+          </w:rPr>
+          <w:t>Næringsliv</w:t>
+        </w:r>
+        <w:proofErr w:type="spellEnd"/>
+        <w:r>
+          <w:rPr>
+            <w:rStyle w:val="Hyperlink"/>
+            <w:rFonts w:ascii="Palatino Linotype" w:hAnsi="Palatino Linotype"/>
+            <w:lang w:val="en-US"/>
+          </w:rPr>
+          <w:t>, 2021.</w:t>
         </w:r>
       </w:hyperlink>
     </w:p>
@@ -4772,7 +4957,6 @@
   <w:style w:type="character" w:default="1" w:styleId="DefaultParagraphFont">
     <w:name w:val="Default Paragraph Font"/>
     <w:uiPriority w:val="1"/>
-    <w:semiHidden/>
     <w:unhideWhenUsed/>
   </w:style>
   <w:style w:type="table" w:default="1" w:styleId="TableNormal">

</xml_diff>